<commit_message>
Confirm 54 repository PDFs in worker briefs
</commit_message>
<xml_diff>
--- a/project-admin/Master_OCR_Allocation_Plan.docx
+++ b/project-admin/Master_OCR_Allocation_Plan.docx
@@ -44,7 +44,7 @@
         <w:pStyle w:val="ListBullet"/>
       </w:pPr>
       <w:r>
-        <w:t>The user reported 55 additional PDFs in the repository; only 54 are present in the checked-out main branch. One expected repository PDF is therefore not yet accounted for here. It may be unpushed, on another branch, or still to be added.</w:t>
+        <w:t>The user has confirmed that the repository contains 54 PDFs across the other chapters (2,128 pages). Together with the 12 Sequence &amp; Series PDFs attached in this chat (496 pages), the current total is 66 PDFs and 2,624 pages; no extra repository PDF is currently expected.</w:t>
       </w:r>
     </w:p>
     <w:p>
@@ -1041,7 +1041,7 @@
     </w:p>
     <w:p>
       <w:r>
-        <w:t>When the 55th repository PDF is located/pushed, add it to the inventory, read chapter/lecture from the cover, count pages, calculate a checksum, and assign it to the worker with the lowest page total. Recheck the five-way workload balance before OCR begins.</w:t>
+        <w:t>The repository set is confirmed at 54 PDFs. If additional PDFs are added later, inventory each one and assign it to the worker with the lowest page total before OCR begins.</w:t>
       </w:r>
     </w:p>
     <w:p>

</xml_diff>